<commit_message>
docs: inclusion de l'etape 3 et 4 dans les rapports
</commit_message>
<xml_diff>
--- a/RAPPORT.docx
+++ b/RAPPORT.docx
@@ -2,7 +2,7 @@
 <file path=word/document.xml><?xml version="1.0" encoding="utf-8"?>
 <w:document xmlns:w="http://schemas.openxmlformats.org/wordprocessingml/2006/main" xmlns:m="http://schemas.openxmlformats.org/officeDocument/2006/math" xmlns:r="http://schemas.openxmlformats.org/officeDocument/2006/relationships" xmlns:o="urn:schemas-microsoft-com:office:office" xmlns:v="urn:schemas-microsoft-com:vml" xmlns:w10="urn:schemas-microsoft-com:office:word" xmlns:a="http://schemas.openxmlformats.org/drawingml/2006/main" xmlns:pic="http://schemas.openxmlformats.org/drawingml/2006/picture" xmlns:wp="http://schemas.openxmlformats.org/drawingml/2006/wordprocessingDrawing">
   <w:body>
-    <w:bookmarkStart w:id="42" w:name="X7074ed6ce24e41c64f2d3d42fc5646cdb69217b"/>
+    <w:bookmarkStart w:id="44" w:name="X7074ed6ce24e41c64f2d3d42fc5646cdb69217b"/>
     <w:p>
       <w:pPr>
         <w:pStyle w:val="Heading1"/>
@@ -1597,7 +1597,555 @@
       </w:r>
     </w:p>
     <w:bookmarkEnd w:id="16"/>
-    <w:bookmarkStart w:id="17" w:name="X04e9a9669e4f5342327946731fe6ac606c20de6"/>
+    <w:bookmarkStart w:id="17" w:name="étape-3-containerisation-des-services"/>
+    <w:p>
+      <w:pPr>
+        <w:pStyle w:val="Heading2"/>
+      </w:pPr>
+      <w:r>
+        <w:t xml:space="preserve">Étape 3 — Containerisation des services</w:t>
+      </w:r>
+    </w:p>
+    <w:p>
+      <w:pPr>
+        <w:pStyle w:val="FirstParagraph"/>
+      </w:pPr>
+      <w:r>
+        <w:t xml:space="preserve">Nous avons conteneurisé les microservices en respectant des règles de sécurité et d’optimisation strictes :</w:t>
+      </w:r>
+      <w:r>
+        <w:t xml:space="preserve"> </w:t>
+      </w:r>
+      <w:r>
+        <w:t xml:space="preserve">*</w:t>
+      </w:r>
+      <w:r>
+        <w:t xml:space="preserve"> </w:t>
+      </w:r>
+      <w:r>
+        <w:rPr>
+          <w:b/>
+          <w:bCs/>
+        </w:rPr>
+        <w:t xml:space="preserve">Multi-stage build</w:t>
+      </w:r>
+      <w:r>
+        <w:t xml:space="preserve"> </w:t>
+      </w:r>
+      <w:r>
+        <w:t xml:space="preserve">: Isolation des étapes de compilation (Go/Node/Python) et de runtime.</w:t>
+      </w:r>
+      <w:r>
+        <w:t xml:space="preserve"> </w:t>
+      </w:r>
+      <w:r>
+        <w:t xml:space="preserve">*</w:t>
+      </w:r>
+      <w:r>
+        <w:t xml:space="preserve"> </w:t>
+      </w:r>
+      <w:r>
+        <w:rPr>
+          <w:b/>
+          <w:bCs/>
+        </w:rPr>
+        <w:t xml:space="preserve">Images ultra-légères (non-root)</w:t>
+      </w:r>
+      <w:r>
+        <w:t xml:space="preserve"> </w:t>
+      </w:r>
+      <w:r>
+        <w:t xml:space="preserve">: Utilisation d’images minimales (Alpine, Distroless pour Go).</w:t>
+      </w:r>
+      <w:r>
+        <w:t xml:space="preserve"> </w:t>
+      </w:r>
+      <w:r>
+        <w:t xml:space="preserve">*</w:t>
+      </w:r>
+      <w:r>
+        <w:t xml:space="preserve"> </w:t>
+      </w:r>
+      <w:r>
+        <w:rPr>
+          <w:rStyle w:val="VerbatimChar"/>
+        </w:rPr>
+        <w:t xml:space="preserve">annuaire</w:t>
+      </w:r>
+      <w:r>
+        <w:t xml:space="preserve"> </w:t>
+      </w:r>
+      <w:r>
+        <w:t xml:space="preserve">(Node.js) :</w:t>
+      </w:r>
+      <w:r>
+        <w:t xml:space="preserve"> </w:t>
+      </w:r>
+      <w:r>
+        <w:rPr>
+          <w:b/>
+          <w:bCs/>
+        </w:rPr>
+        <w:t xml:space="preserve">~168 Mo</w:t>
+      </w:r>
+      <w:r>
+        <w:t xml:space="preserve"> </w:t>
+      </w:r>
+      <w:r>
+        <w:t xml:space="preserve">| Utilisateur</w:t>
+      </w:r>
+      <w:r>
+        <w:t xml:space="preserve"> </w:t>
+      </w:r>
+      <w:r>
+        <w:rPr>
+          <w:rStyle w:val="VerbatimChar"/>
+        </w:rPr>
+        <w:t xml:space="preserve">appuser</w:t>
+      </w:r>
+      <w:r>
+        <w:t xml:space="preserve"> </w:t>
+      </w:r>
+      <w:r>
+        <w:t xml:space="preserve">(UID 1001).</w:t>
+      </w:r>
+      <w:r>
+        <w:t xml:space="preserve"> </w:t>
+      </w:r>
+      <w:r>
+        <w:t xml:space="preserve">*</w:t>
+      </w:r>
+      <w:r>
+        <w:t xml:space="preserve"> </w:t>
+      </w:r>
+      <w:r>
+        <w:rPr>
+          <w:rStyle w:val="VerbatimChar"/>
+        </w:rPr>
+        <w:t xml:space="preserve">planning</w:t>
+      </w:r>
+      <w:r>
+        <w:t xml:space="preserve"> </w:t>
+      </w:r>
+      <w:r>
+        <w:t xml:space="preserve">(Python FastAPI) :</w:t>
+      </w:r>
+      <w:r>
+        <w:t xml:space="preserve"> </w:t>
+      </w:r>
+      <w:r>
+        <w:rPr>
+          <w:b/>
+          <w:bCs/>
+        </w:rPr>
+        <w:t xml:space="preserve">~122 Mo</w:t>
+      </w:r>
+      <w:r>
+        <w:t xml:space="preserve"> </w:t>
+      </w:r>
+      <w:r>
+        <w:t xml:space="preserve">| Utilisateur</w:t>
+      </w:r>
+      <w:r>
+        <w:t xml:space="preserve"> </w:t>
+      </w:r>
+      <w:r>
+        <w:rPr>
+          <w:rStyle w:val="VerbatimChar"/>
+        </w:rPr>
+        <w:t xml:space="preserve">appuser</w:t>
+      </w:r>
+      <w:r>
+        <w:t xml:space="preserve"> </w:t>
+      </w:r>
+      <w:r>
+        <w:t xml:space="preserve">(UID 1001).</w:t>
+      </w:r>
+      <w:r>
+        <w:t xml:space="preserve"> </w:t>
+      </w:r>
+      <w:r>
+        <w:t xml:space="preserve">*</w:t>
+      </w:r>
+      <w:r>
+        <w:t xml:space="preserve"> </w:t>
+      </w:r>
+      <w:r>
+        <w:rPr>
+          <w:rStyle w:val="VerbatimChar"/>
+        </w:rPr>
+        <w:t xml:space="preserve">notif</w:t>
+      </w:r>
+      <w:r>
+        <w:t xml:space="preserve"> </w:t>
+      </w:r>
+      <w:r>
+        <w:t xml:space="preserve">(Go statique) :</w:t>
+      </w:r>
+      <w:r>
+        <w:t xml:space="preserve"> </w:t>
+      </w:r>
+      <w:r>
+        <w:rPr>
+          <w:b/>
+          <w:bCs/>
+        </w:rPr>
+        <w:t xml:space="preserve">~35 Mo</w:t>
+      </w:r>
+      <w:r>
+        <w:t xml:space="preserve"> </w:t>
+      </w:r>
+      <w:r>
+        <w:t xml:space="preserve">| Utilisateur distroless</w:t>
+      </w:r>
+      <w:r>
+        <w:t xml:space="preserve"> </w:t>
+      </w:r>
+      <w:r>
+        <w:rPr>
+          <w:rStyle w:val="VerbatimChar"/>
+        </w:rPr>
+        <w:t xml:space="preserve">nonroot</w:t>
+      </w:r>
+      <w:r>
+        <w:t xml:space="preserve">.</w:t>
+      </w:r>
+      <w:r>
+        <w:t xml:space="preserve"> </w:t>
+      </w:r>
+      <w:r>
+        <w:t xml:space="preserve">*</w:t>
+      </w:r>
+      <w:r>
+        <w:t xml:space="preserve"> </w:t>
+      </w:r>
+      <w:r>
+        <w:rPr>
+          <w:b/>
+          <w:bCs/>
+        </w:rPr>
+        <w:t xml:space="preserve">Health Check</w:t>
+      </w:r>
+      <w:r>
+        <w:t xml:space="preserve"> </w:t>
+      </w:r>
+      <w:r>
+        <w:t xml:space="preserve">: Exposition d’un endpoint</w:t>
+      </w:r>
+      <w:r>
+        <w:t xml:space="preserve"> </w:t>
+      </w:r>
+      <w:r>
+        <w:rPr>
+          <w:rStyle w:val="VerbatimChar"/>
+        </w:rPr>
+        <w:t xml:space="preserve">/healthz</w:t>
+      </w:r>
+      <w:r>
+        <w:t xml:space="preserve"> </w:t>
+      </w:r>
+      <w:r>
+        <w:t xml:space="preserve">sur le port</w:t>
+      </w:r>
+      <w:r>
+        <w:t xml:space="preserve"> </w:t>
+      </w:r>
+      <w:r>
+        <w:rPr>
+          <w:rStyle w:val="VerbatimChar"/>
+        </w:rPr>
+        <w:t xml:space="preserve">8080</w:t>
+      </w:r>
+      <w:r>
+        <w:t xml:space="preserve"> </w:t>
+      </w:r>
+      <w:r>
+        <w:t xml:space="preserve">de chaque service.</w:t>
+      </w:r>
+    </w:p>
+    <w:p>
+      <w:r>
+        <w:pict>
+          <v:rect style="width:0;height:1.5pt" o:hralign="center" o:hrstd="t" o:hr="t"/>
+        </w:pict>
+      </w:r>
+    </w:p>
+    <w:bookmarkEnd w:id="17"/>
+    <w:bookmarkStart w:id="18" w:name="étape-4-écriture-des-charts-helm"/>
+    <w:p>
+      <w:pPr>
+        <w:pStyle w:val="Heading2"/>
+      </w:pPr>
+      <w:r>
+        <w:t xml:space="preserve">Étape 4 — Écriture des Charts Helm</w:t>
+      </w:r>
+    </w:p>
+    <w:p>
+      <w:pPr>
+        <w:pStyle w:val="FirstParagraph"/>
+      </w:pPr>
+      <w:r>
+        <w:t xml:space="preserve">Chaque microservice dispose d’un chart Helm modulaire et paramétrable :</w:t>
+      </w:r>
+      <w:r>
+        <w:t xml:space="preserve"> </w:t>
+      </w:r>
+      <w:r>
+        <w:t xml:space="preserve">*</w:t>
+      </w:r>
+      <w:r>
+        <w:t xml:space="preserve"> </w:t>
+      </w:r>
+      <w:r>
+        <w:rPr>
+          <w:b/>
+          <w:bCs/>
+        </w:rPr>
+        <w:t xml:space="preserve">Structure standard</w:t>
+      </w:r>
+      <w:r>
+        <w:t xml:space="preserve"> </w:t>
+      </w:r>
+      <w:r>
+        <w:t xml:space="preserve">:</w:t>
+      </w:r>
+      <w:r>
+        <w:t xml:space="preserve"> </w:t>
+      </w:r>
+      <w:r>
+        <w:rPr>
+          <w:rStyle w:val="VerbatimChar"/>
+        </w:rPr>
+        <w:t xml:space="preserve">Chart.yaml</w:t>
+      </w:r>
+      <w:r>
+        <w:t xml:space="preserve">,</w:t>
+      </w:r>
+      <w:r>
+        <w:t xml:space="preserve"> </w:t>
+      </w:r>
+      <w:r>
+        <w:rPr>
+          <w:rStyle w:val="VerbatimChar"/>
+        </w:rPr>
+        <w:t xml:space="preserve">values.yaml</w:t>
+      </w:r>
+      <w:r>
+        <w:t xml:space="preserve">, et dossier</w:t>
+      </w:r>
+      <w:r>
+        <w:t xml:space="preserve"> </w:t>
+      </w:r>
+      <w:r>
+        <w:rPr>
+          <w:rStyle w:val="VerbatimChar"/>
+        </w:rPr>
+        <w:t xml:space="preserve">templates/</w:t>
+      </w:r>
+      <w:r>
+        <w:t xml:space="preserve"> </w:t>
+      </w:r>
+      <w:r>
+        <w:t xml:space="preserve">(</w:t>
+      </w:r>
+      <w:r>
+        <w:rPr>
+          <w:rStyle w:val="VerbatimChar"/>
+        </w:rPr>
+        <w:t xml:space="preserve">deployment.yaml</w:t>
+      </w:r>
+      <w:r>
+        <w:t xml:space="preserve">,</w:t>
+      </w:r>
+      <w:r>
+        <w:t xml:space="preserve"> </w:t>
+      </w:r>
+      <w:r>
+        <w:rPr>
+          <w:rStyle w:val="VerbatimChar"/>
+        </w:rPr>
+        <w:t xml:space="preserve">service.yaml</w:t>
+      </w:r>
+      <w:r>
+        <w:t xml:space="preserve">,</w:t>
+      </w:r>
+      <w:r>
+        <w:t xml:space="preserve"> </w:t>
+      </w:r>
+      <w:r>
+        <w:rPr>
+          <w:rStyle w:val="VerbatimChar"/>
+        </w:rPr>
+        <w:t xml:space="preserve">ingress.yaml</w:t>
+      </w:r>
+      <w:r>
+        <w:t xml:space="preserve">,</w:t>
+      </w:r>
+      <w:r>
+        <w:t xml:space="preserve"> </w:t>
+      </w:r>
+      <w:r>
+        <w:rPr>
+          <w:rStyle w:val="VerbatimChar"/>
+        </w:rPr>
+        <w:t xml:space="preserve">_helpers.tpl</w:t>
+      </w:r>
+      <w:r>
+        <w:t xml:space="preserve">).</w:t>
+      </w:r>
+      <w:r>
+        <w:t xml:space="preserve"> </w:t>
+      </w:r>
+      <w:r>
+        <w:t xml:space="preserve">*</w:t>
+      </w:r>
+      <w:r>
+        <w:t xml:space="preserve"> </w:t>
+      </w:r>
+      <w:r>
+        <w:rPr>
+          <w:b/>
+          <w:bCs/>
+        </w:rPr>
+        <w:t xml:space="preserve">Surcharges par environnement</w:t>
+      </w:r>
+      <w:r>
+        <w:t xml:space="preserve"> </w:t>
+      </w:r>
+      <w:r>
+        <w:t xml:space="preserve">:</w:t>
+      </w:r>
+      <w:r>
+        <w:t xml:space="preserve"> </w:t>
+      </w:r>
+      <w:r>
+        <w:t xml:space="preserve">*</w:t>
+      </w:r>
+      <w:r>
+        <w:t xml:space="preserve"> </w:t>
+      </w:r>
+      <w:r>
+        <w:rPr>
+          <w:rStyle w:val="VerbatimChar"/>
+        </w:rPr>
+        <w:t xml:space="preserve">values-dev.yaml</w:t>
+      </w:r>
+      <w:r>
+        <w:t xml:space="preserve"> </w:t>
+      </w:r>
+      <w:r>
+        <w:t xml:space="preserve">: Mode stable (2 replicas, ressources allouées, Ingress actif sur le domaine</w:t>
+      </w:r>
+      <w:r>
+        <w:t xml:space="preserve"> </w:t>
+      </w:r>
+      <w:r>
+        <w:rPr>
+          <w:rStyle w:val="VerbatimChar"/>
+        </w:rPr>
+        <w:t xml:space="preserve">.devhub.local</w:t>
+      </w:r>
+      <w:r>
+        <w:t xml:space="preserve">).</w:t>
+      </w:r>
+      <w:r>
+        <w:t xml:space="preserve"> </w:t>
+      </w:r>
+      <w:r>
+        <w:t xml:space="preserve">*</w:t>
+      </w:r>
+      <w:r>
+        <w:t xml:space="preserve"> </w:t>
+      </w:r>
+      <w:r>
+        <w:rPr>
+          <w:rStyle w:val="VerbatimChar"/>
+        </w:rPr>
+        <w:t xml:space="preserve">values-preview.yaml</w:t>
+      </w:r>
+      <w:r>
+        <w:t xml:space="preserve"> </w:t>
+      </w:r>
+      <w:r>
+        <w:t xml:space="preserve">: Mode éphémère (1 replica, ressources minimisées, Ingress dynamique configuré par l’ApplicationSet).</w:t>
+      </w:r>
+      <w:r>
+        <w:t xml:space="preserve"> </w:t>
+      </w:r>
+      <w:r>
+        <w:t xml:space="preserve">*</w:t>
+      </w:r>
+      <w:r>
+        <w:t xml:space="preserve"> </w:t>
+      </w:r>
+      <w:r>
+        <w:rPr>
+          <w:b/>
+          <w:bCs/>
+        </w:rPr>
+        <w:t xml:space="preserve">Robustesse applicative</w:t>
+      </w:r>
+      <w:r>
+        <w:t xml:space="preserve"> </w:t>
+      </w:r>
+      <w:r>
+        <w:t xml:space="preserve">: Intégration systématique de sondes</w:t>
+      </w:r>
+      <w:r>
+        <w:t xml:space="preserve"> </w:t>
+      </w:r>
+      <w:r>
+        <w:rPr>
+          <w:rStyle w:val="VerbatimChar"/>
+        </w:rPr>
+        <w:t xml:space="preserve">livenessProbe</w:t>
+      </w:r>
+      <w:r>
+        <w:t xml:space="preserve"> </w:t>
+      </w:r>
+      <w:r>
+        <w:t xml:space="preserve">et</w:t>
+      </w:r>
+      <w:r>
+        <w:t xml:space="preserve"> </w:t>
+      </w:r>
+      <w:r>
+        <w:rPr>
+          <w:rStyle w:val="VerbatimChar"/>
+        </w:rPr>
+        <w:t xml:space="preserve">readinessProbe</w:t>
+      </w:r>
+      <w:r>
+        <w:t xml:space="preserve"> </w:t>
+      </w:r>
+      <w:r>
+        <w:t xml:space="preserve">HTTP sur</w:t>
+      </w:r>
+      <w:r>
+        <w:t xml:space="preserve"> </w:t>
+      </w:r>
+      <w:r>
+        <w:rPr>
+          <w:rStyle w:val="VerbatimChar"/>
+        </w:rPr>
+        <w:t xml:space="preserve">/healthz</w:t>
+      </w:r>
+      <w:r>
+        <w:t xml:space="preserve"> </w:t>
+      </w:r>
+      <w:r>
+        <w:t xml:space="preserve">exécutées toutes les 10 secondes.</w:t>
+      </w:r>
+    </w:p>
+    <w:p>
+      <w:r>
+        <w:pict>
+          <v:rect style="width:0;height:1.5pt" o:hralign="center" o:hrstd="t" o:hr="t"/>
+        </w:pict>
+      </w:r>
+    </w:p>
+    <w:bookmarkEnd w:id="18"/>
+    <w:bookmarkStart w:id="19" w:name="X04e9a9669e4f5342327946731fe6ac606c20de6"/>
     <w:p>
       <w:pPr>
         <w:pStyle w:val="Heading2"/>
@@ -1791,8 +2339,8 @@
         </w:pict>
       </w:r>
     </w:p>
-    <w:bookmarkEnd w:id="17"/>
-    <w:bookmarkStart w:id="19" w:name="étape-6-le-pattern-app-of-apps"/>
+    <w:bookmarkEnd w:id="19"/>
+    <w:bookmarkStart w:id="21" w:name="étape-6-le-pattern-app-of-apps"/>
     <w:p>
       <w:pPr>
         <w:pStyle w:val="Heading2"/>
@@ -1811,7 +2359,7 @@
         <w:t xml:space="preserve">App of Apps</w:t>
       </w:r>
     </w:p>
-    <w:bookmarkStart w:id="18" w:name="X00faaf7d3b402b0a0eff7794571f95ba85d2a29"/>
+    <w:bookmarkStart w:id="20" w:name="X00faaf7d3b402b0a0eff7794571f95ba85d2a29"/>
     <w:p>
       <w:pPr>
         <w:pStyle w:val="Heading3"/>
@@ -1991,9 +2539,9 @@
         </w:pict>
       </w:r>
     </w:p>
-    <w:bookmarkEnd w:id="18"/>
-    <w:bookmarkEnd w:id="19"/>
-    <w:bookmarkStart w:id="26" w:name="Xbf1c50bd40b8bc051c3a58cb0a15613e04d4eb3"/>
+    <w:bookmarkEnd w:id="20"/>
+    <w:bookmarkEnd w:id="21"/>
+    <w:bookmarkStart w:id="28" w:name="Xbf1c50bd40b8bc051c3a58cb0a15613e04d4eb3"/>
     <w:p>
       <w:pPr>
         <w:pStyle w:val="Heading2"/>
@@ -2002,7 +2550,7 @@
         <w:t xml:space="preserve">Étape 8 — Le Bestiaire d’ArgoCD (Drift, Rollback, Hooks, Sync Waves)</w:t>
       </w:r>
     </w:p>
-    <w:bookmarkStart w:id="20" w:name="le-drift-manuel-kubectl-scale"/>
+    <w:bookmarkStart w:id="22" w:name="le-drift-manuel-kubectl-scale"/>
     <w:p>
       <w:pPr>
         <w:pStyle w:val="Heading3"/>
@@ -2088,8 +2636,8 @@
         <w:t xml:space="preserve">, ArgoCD détecte l’écart avec la source Git et réapplique la configuration d’origine pour forcer le retour à 2 répliques.</w:t>
       </w:r>
     </w:p>
-    <w:bookmarkEnd w:id="20"/>
-    <w:bookmarkStart w:id="21" w:name="X9b74a509f54e34cf700385e80475825aa85e178"/>
+    <w:bookmarkEnd w:id="22"/>
+    <w:bookmarkStart w:id="23" w:name="X9b74a509f54e34cf700385e80475825aa85e178"/>
     <w:p>
       <w:pPr>
         <w:pStyle w:val="Heading3"/>
@@ -2178,8 +2726,8 @@
         <w:t xml:space="preserve">: La synchronisation réussit car le manifest YAML Git est valide, mais Kubernetes ne peut pas démarrer les Pods car l’image n’est pas téléchargeable.</w:t>
       </w:r>
     </w:p>
-    <w:bookmarkEnd w:id="21"/>
-    <w:bookmarkStart w:id="22" w:name="le-rollback-par-git-revert"/>
+    <w:bookmarkEnd w:id="23"/>
+    <w:bookmarkStart w:id="24" w:name="le-rollback-par-git-revert"/>
     <w:p>
       <w:pPr>
         <w:pStyle w:val="Heading3"/>
@@ -2268,8 +2816,8 @@
         <w:t xml:space="preserve">.</w:t>
       </w:r>
     </w:p>
-    <w:bookmarkEnd w:id="22"/>
-    <w:bookmarkStart w:id="23" w:name="le-hook-de-migration-presync"/>
+    <w:bookmarkEnd w:id="24"/>
+    <w:bookmarkStart w:id="25" w:name="le-hook-de-migration-presync"/>
     <w:p>
       <w:pPr>
         <w:pStyle w:val="Heading3"/>
@@ -2331,8 +2879,8 @@
         <w:t xml:space="preserve">: Permet de sécuriser le schéma de base de données. Si le Job échoue, ArgoCD bloque la mise à jour des Pods.</w:t>
       </w:r>
     </w:p>
-    <w:bookmarkEnd w:id="23"/>
-    <w:bookmarkStart w:id="24" w:name="les-sync-waves"/>
+    <w:bookmarkEnd w:id="25"/>
+    <w:bookmarkStart w:id="26" w:name="les-sync-waves"/>
     <w:p>
       <w:pPr>
         <w:pStyle w:val="Heading3"/>
@@ -2409,8 +2957,8 @@
         <w:t xml:space="preserve">: Garantit que les configurations sont prêtes en base avant que le code applicatif ne tente de s’y connecter.</w:t>
       </w:r>
     </w:p>
-    <w:bookmarkEnd w:id="24"/>
-    <w:bookmarkStart w:id="25" w:name="le-pruning-dune-ressource-retirée-de-git"/>
+    <w:bookmarkEnd w:id="26"/>
+    <w:bookmarkStart w:id="27" w:name="le-pruning-dune-ressource-retirée-de-git"/>
     <w:p>
       <w:pPr>
         <w:pStyle w:val="Heading3"/>
@@ -2485,9 +3033,9 @@
         </w:pict>
       </w:r>
     </w:p>
-    <w:bookmarkEnd w:id="25"/>
-    <w:bookmarkEnd w:id="26"/>
-    <w:bookmarkStart w:id="28" w:name="étape-9-sécuriser-et-observer-argocd"/>
+    <w:bookmarkEnd w:id="27"/>
+    <w:bookmarkEnd w:id="28"/>
+    <w:bookmarkStart w:id="30" w:name="étape-9-sécuriser-et-observer-argocd"/>
     <w:p>
       <w:pPr>
         <w:pStyle w:val="Heading2"/>
@@ -2496,7 +3044,7 @@
         <w:t xml:space="preserve">Étape 9 — Sécuriser et observer ArgoCD</w:t>
       </w:r>
     </w:p>
-    <w:bookmarkStart w:id="27" w:name="Xd210e773a1ae698aef2698fcc54f9e1ddd99c01"/>
+    <w:bookmarkStart w:id="29" w:name="Xd210e773a1ae698aef2698fcc54f9e1ddd99c01"/>
     <w:p>
       <w:pPr>
         <w:pStyle w:val="Heading3"/>
@@ -2635,9 +3183,9 @@
         </w:pict>
       </w:r>
     </w:p>
-    <w:bookmarkEnd w:id="27"/>
-    <w:bookmarkEnd w:id="28"/>
-    <w:bookmarkStart w:id="29" w:name="étape-10-comparer-les-outils-gitops"/>
+    <w:bookmarkEnd w:id="29"/>
+    <w:bookmarkEnd w:id="30"/>
+    <w:bookmarkStart w:id="31" w:name="étape-10-comparer-les-outils-gitops"/>
     <w:p>
       <w:pPr>
         <w:pStyle w:val="Heading2"/>
@@ -3224,8 +3772,8 @@
         </w:pict>
       </w:r>
     </w:p>
-    <w:bookmarkEnd w:id="29"/>
-    <w:bookmarkStart w:id="41" w:name="Xbc754b0d4bbedfe654357ca9e27f30b6631e67e"/>
+    <w:bookmarkEnd w:id="31"/>
+    <w:bookmarkStart w:id="43" w:name="Xbc754b0d4bbedfe654357ca9e27f30b6631e67e"/>
     <w:p>
       <w:pPr>
         <w:pStyle w:val="Heading2"/>
@@ -3234,7 +3782,7 @@
         <w:t xml:space="preserve">Étape 11 — Synthèse obligatoire : « ArgoCD, et la prod alors ? »</w:t>
       </w:r>
     </w:p>
-    <w:bookmarkStart w:id="32" w:name="livrable-1-rétrospective-tp-1-tp-2"/>
+    <w:bookmarkStart w:id="34" w:name="livrable-1-rétrospective-tp-1-tp-2"/>
     <w:p>
       <w:pPr>
         <w:pStyle w:val="Heading3"/>
@@ -4403,7 +4951,7 @@
         </w:tc>
       </w:tr>
     </w:tbl>
-    <w:bookmarkStart w:id="30" w:name="X77aff6950af60108b048c1143b3ec75dd2e04d8"/>
+    <w:bookmarkStart w:id="32" w:name="X77aff6950af60108b048c1143b3ec75dd2e04d8"/>
     <w:p>
       <w:pPr>
         <w:pStyle w:val="Heading4"/>
@@ -4471,8 +5019,8 @@
         <w:t xml:space="preserve">local.</w:t>
       </w:r>
     </w:p>
-    <w:bookmarkEnd w:id="30"/>
-    <w:bookmarkStart w:id="31" w:name="Xdddc4e7aac752928394f23ac5f691d60b1d6ada"/>
+    <w:bookmarkEnd w:id="32"/>
+    <w:bookmarkStart w:id="33" w:name="Xdddc4e7aac752928394f23ac5f691d60b1d6ada"/>
     <w:p>
       <w:pPr>
         <w:pStyle w:val="Heading4"/>
@@ -4524,9 +5072,9 @@
         </w:pict>
       </w:r>
     </w:p>
-    <w:bookmarkEnd w:id="31"/>
-    <w:bookmarkEnd w:id="32"/>
-    <w:bookmarkStart w:id="40" w:name="X5bc748b4a111a6c3f4169a41b1794fd75e15f73"/>
+    <w:bookmarkEnd w:id="33"/>
+    <w:bookmarkEnd w:id="34"/>
+    <w:bookmarkStart w:id="42" w:name="X5bc748b4a111a6c3f4169a41b1794fd75e15f73"/>
     <w:p>
       <w:pPr>
         <w:pStyle w:val="Heading3"/>
@@ -4635,7 +5183,7 @@
       <w:r>
         <w:t xml:space="preserve"> </w:t>
       </w:r>
-      <w:hyperlink r:id="rId33">
+      <w:hyperlink r:id="rId35">
         <w:r>
           <w:rPr>
             <w:rStyle w:val="Hyperlink"/>
@@ -4760,7 +5308,7 @@
       <w:r>
         <w:t xml:space="preserve"> </w:t>
       </w:r>
-      <w:hyperlink r:id="rId34">
+      <w:hyperlink r:id="rId36">
         <w:r>
           <w:rPr>
             <w:rStyle w:val="Hyperlink"/>
@@ -4882,7 +5430,7 @@
       <w:r>
         <w:t xml:space="preserve"> </w:t>
       </w:r>
-      <w:hyperlink r:id="rId35">
+      <w:hyperlink r:id="rId37">
         <w:r>
           <w:rPr>
             <w:rStyle w:val="Hyperlink"/>
@@ -4991,7 +5539,7 @@
       <w:r>
         <w:t xml:space="preserve"> </w:t>
       </w:r>
-      <w:hyperlink r:id="rId36">
+      <w:hyperlink r:id="rId38">
         <w:r>
           <w:rPr>
             <w:rStyle w:val="Hyperlink"/>
@@ -5035,7 +5583,7 @@
         <w:t xml:space="preserve"> </w:t>
       </w:r>
       <w:r>
-        <w:t xml:space="preserve">: Un développeur modifie ou supprime une application d’une autre équipe par accident.</w:t>
+        <w:t xml:space="preserve">: Un développeur modifie ou suprrime une application d’une autre équipe par accident.</w:t>
       </w:r>
     </w:p>
     <w:p>
@@ -5100,7 +5648,7 @@
       <w:r>
         <w:t xml:space="preserve"> </w:t>
       </w:r>
-      <w:hyperlink r:id="rId37">
+      <w:hyperlink r:id="rId39">
         <w:r>
           <w:rPr>
             <w:rStyle w:val="Hyperlink"/>
@@ -5182,7 +5730,7 @@
         <w:t xml:space="preserve"> </w:t>
       </w:r>
       <w:r>
-        <w:t xml:space="preserve">pour la sauvegarde et restauration des volumes persistants (PVC).</w:t>
+        <w:t xml:space="preserve">pour la sauvegarde et restauration des PVC.</w:t>
       </w:r>
     </w:p>
     <w:p>
@@ -5209,7 +5757,7 @@
       <w:r>
         <w:t xml:space="preserve"> </w:t>
       </w:r>
-      <w:hyperlink r:id="rId38">
+      <w:hyperlink r:id="rId40">
         <w:r>
           <w:rPr>
             <w:rStyle w:val="Hyperlink"/>
@@ -5318,7 +5866,7 @@
       <w:r>
         <w:t xml:space="preserve"> </w:t>
       </w:r>
-      <w:hyperlink r:id="rId39">
+      <w:hyperlink r:id="rId41">
         <w:r>
           <w:rPr>
             <w:rStyle w:val="Hyperlink"/>
@@ -5327,9 +5875,9 @@
         </w:r>
       </w:hyperlink>
     </w:p>
-    <w:bookmarkEnd w:id="40"/>
-    <w:bookmarkEnd w:id="41"/>
     <w:bookmarkEnd w:id="42"/>
+    <w:bookmarkEnd w:id="43"/>
+    <w:bookmarkEnd w:id="44"/>
     <w:sectPr>
       <w:footnotePr>
         <w:numRestart w:val="eachSect"/>

</xml_diff>

<commit_message>
docs: finalize Etape 0 tool versions in report
</commit_message>
<xml_diff>
--- a/RAPPORT.docx
+++ b/RAPPORT.docx
@@ -87,18 +87,6 @@
     </w:p>
     <w:p>
       <w:pPr>
-        <w:pStyle w:val="FirstParagraph"/>
-      </w:pPr>
-      <w:r>
-        <w:rPr>
-          <w:i/>
-          <w:iCs/>
-        </w:rPr>
-        <w:t xml:space="preserve">Note : Insérer les versions de vos outils après leur installation locale.</w:t>
-      </w:r>
-    </w:p>
-    <w:p>
-      <w:pPr>
         <w:pStyle w:val="SourceCode"/>
       </w:pPr>
       <w:r>
@@ -114,18 +102,45 @@
         <w:rPr>
           <w:rStyle w:val="VerbatimChar"/>
         </w:rPr>
-        <w:t xml:space="preserve">[Insérer la sortie ici]</w:t>
+        <w:t xml:space="preserve">kubectl-argo-rollouts: v1.7.1+6a99ea9</w:t>
       </w:r>
       <w:r>
         <w:br/>
       </w:r>
       <w:r>
+        <w:rPr>
+          <w:rStyle w:val="VerbatimChar"/>
+        </w:rPr>
+        <w:t xml:space="preserve">  BuildDate: 2024-06-24T22:53:28Z</w:t>
+      </w:r>
+      <w:r>
         <w:br/>
       </w:r>
       <w:r>
         <w:rPr>
           <w:rStyle w:val="VerbatimChar"/>
         </w:rPr>
+        <w:t xml:space="preserve">  GitCommit: 6a99ea9908e8f1e816ccd71e4c35adbbbbdd5f6c</w:t>
+      </w:r>
+      <w:r>
+        <w:br/>
+      </w:r>
+      <w:r>
+        <w:rPr>
+          <w:rStyle w:val="VerbatimChar"/>
+        </w:rPr>
+        <w:t xml:space="preserve">  Platform: windows/amd64</w:t>
+      </w:r>
+      <w:r>
+        <w:br/>
+      </w:r>
+      <w:r>
+        <w:br/>
+      </w:r>
+      <w:r>
+        <w:rPr>
+          <w:rStyle w:val="VerbatimChar"/>
+        </w:rPr>
         <w:t xml:space="preserve">$ promtool --version</w:t>
       </w:r>
       <w:r>
@@ -135,7 +150,46 @@
         <w:rPr>
           <w:rStyle w:val="VerbatimChar"/>
         </w:rPr>
-        <w:t xml:space="preserve">[Insérer la sortie ici]</w:t>
+        <w:t xml:space="preserve">promtool, version 2.53.1 (branch: HEAD, revision: 14cfec3f6048b735e08c1e9c64c8d4211d32bab4)</w:t>
+      </w:r>
+      <w:r>
+        <w:br/>
+      </w:r>
+      <w:r>
+        <w:rPr>
+          <w:rStyle w:val="VerbatimChar"/>
+        </w:rPr>
+        <w:t xml:space="preserve">  build date:       20240710-10:18:30</w:t>
+      </w:r>
+      <w:r>
+        <w:br/>
+      </w:r>
+      <w:r>
+        <w:rPr>
+          <w:rStyle w:val="VerbatimChar"/>
+        </w:rPr>
+        <w:t xml:space="preserve">  platform:         windows/amd64</w:t>
+      </w:r>
+      <w:r>
+        <w:br/>
+      </w:r>
+      <w:r>
+        <w:br/>
+      </w:r>
+      <w:r>
+        <w:rPr>
+          <w:rStyle w:val="VerbatimChar"/>
+        </w:rPr>
+        <w:t xml:space="preserve">$ jq --version</w:t>
+      </w:r>
+      <w:r>
+        <w:br/>
+      </w:r>
+      <w:r>
+        <w:rPr>
+          <w:rStyle w:val="VerbatimChar"/>
+        </w:rPr>
+        <w:t xml:space="preserve">jq-1.7.1</w:t>
       </w:r>
     </w:p>
     <w:p>

</xml_diff>